<commit_message>
3LD: Implement all code and most of the report
</commit_message>
<xml_diff>
--- a/3LD/3LD.docx
+++ b/3LD/3LD.docx
@@ -653,6 +653,7 @@
     <w:p>
       <w:pPr>
         <w:pStyle w:val="ISITekstas"/>
+        <w:ind w:firstLine="0"/>
         <w:jc w:val="center"/>
         <w:rPr>
           <w:i/>
@@ -671,6 +672,7 @@
     <w:p>
       <w:pPr>
         <w:pStyle w:val="ISITekstas"/>
+        <w:ind w:firstLine="0"/>
         <w:jc w:val="center"/>
       </w:pPr>
     </w:p>
@@ -775,6 +777,7 @@
     <w:p>
       <w:pPr>
         <w:pStyle w:val="ISITekstas"/>
+        <w:ind w:firstLine="0"/>
         <w:jc w:val="center"/>
         <w:rPr>
           <w:i/>
@@ -918,6 +921,7 @@
     <w:p>
       <w:pPr>
         <w:pStyle w:val="ISITekstas"/>
+        <w:ind w:firstLine="0"/>
         <w:jc w:val="center"/>
         <w:rPr>
           <w:i/>
@@ -948,6 +952,7 @@
     <w:p>
       <w:pPr>
         <w:pStyle w:val="ISITekstas"/>
+        <w:ind w:firstLine="0"/>
         <w:jc w:val="center"/>
         <w:rPr>
           <w:i/>
@@ -1048,6 +1053,7 @@
     <w:p>
       <w:pPr>
         <w:pStyle w:val="ISITekstas"/>
+        <w:ind w:firstLine="0"/>
         <w:jc w:val="center"/>
         <w:rPr>
           <w:i/>
@@ -1148,6 +1154,7 @@
     <w:p>
       <w:pPr>
         <w:pStyle w:val="ISITekstas"/>
+        <w:ind w:firstLine="0"/>
         <w:jc w:val="center"/>
         <w:rPr>
           <w:i/>
@@ -1248,6 +1255,7 @@
     <w:p>
       <w:pPr>
         <w:pStyle w:val="ISITekstas"/>
+        <w:ind w:firstLine="0"/>
         <w:jc w:val="center"/>
         <w:rPr>
           <w:i/>
@@ -1307,10 +1315,9 @@
     <w:p>
       <w:pPr>
         <w:pStyle w:val="ISITekstas"/>
+        <w:keepNext/>
+        <w:ind w:firstLine="0"/>
         <w:jc w:val="center"/>
-        <w:rPr>
-          <w:lang w:val="en-US"/>
-        </w:rPr>
       </w:pPr>
       <w:r>
         <w:drawing>
@@ -1352,6 +1359,36 @@
     </w:p>
     <w:p>
       <w:pPr>
+        <w:pStyle w:val="Caption"/>
+        <w:jc w:val="center"/>
+        <w:rPr>
+          <w:lang w:val="en-US"/>
+        </w:rPr>
+      </w:pPr>
+      <w:r>
+        <w:t xml:space="preserve">pav. </w:t>
+      </w:r>
+      <w:r>
+        <w:fldChar w:fldCharType="begin"/>
+      </w:r>
+      <w:r>
+        <w:instrText xml:space="preserve"> SEQ pav. \* ARABIC </w:instrText>
+      </w:r>
+      <w:r>
+        <w:fldChar w:fldCharType="separate"/>
+      </w:r>
+      <w:r>
+        <w:t>1</w:t>
+      </w:r>
+      <w:r>
+        <w:fldChar w:fldCharType="end"/>
+      </w:r>
+      <w:r>
+        <w:t xml:space="preserve"> tikslo funkcija</w:t>
+      </w:r>
+    </w:p>
+    <w:p>
+      <w:pPr>
         <w:pStyle w:val="ISITekstas"/>
         <w:jc w:val="center"/>
         <w:rPr>
@@ -1362,10 +1399,9 @@
     <w:p>
       <w:pPr>
         <w:pStyle w:val="ISITekstas"/>
+        <w:keepNext/>
+        <w:ind w:firstLine="0"/>
         <w:jc w:val="center"/>
-        <w:rPr>
-          <w:lang w:val="en-US"/>
-        </w:rPr>
       </w:pPr>
       <w:r>
         <w:drawing>
@@ -1407,6 +1443,36 @@
     </w:p>
     <w:p>
       <w:pPr>
+        <w:pStyle w:val="Caption"/>
+        <w:jc w:val="center"/>
+        <w:rPr>
+          <w:lang w:val="en-US"/>
+        </w:rPr>
+      </w:pPr>
+      <w:r>
+        <w:t xml:space="preserve">pav. </w:t>
+      </w:r>
+      <w:r>
+        <w:fldChar w:fldCharType="begin"/>
+      </w:r>
+      <w:r>
+        <w:instrText xml:space="preserve"> SEQ pav. \* ARABIC </w:instrText>
+      </w:r>
+      <w:r>
+        <w:fldChar w:fldCharType="separate"/>
+      </w:r>
+      <w:r>
+        <w:t>2</w:t>
+      </w:r>
+      <w:r>
+        <w:fldChar w:fldCharType="end"/>
+      </w:r>
+      <w:r>
+        <w:t xml:space="preserve"> lygybinio apribojimo funkcija</w:t>
+      </w:r>
+    </w:p>
+    <w:p>
+      <w:pPr>
         <w:pStyle w:val="ISITekstas"/>
         <w:jc w:val="center"/>
         <w:rPr>
@@ -1417,10 +1483,9 @@
     <w:p>
       <w:pPr>
         <w:pStyle w:val="ISITekstas"/>
+        <w:keepNext/>
+        <w:ind w:firstLine="0"/>
         <w:jc w:val="center"/>
-        <w:rPr>
-          <w:lang w:val="en-US"/>
-        </w:rPr>
       </w:pPr>
       <w:r>
         <w:drawing>
@@ -1462,6 +1527,36 @@
     </w:p>
     <w:p>
       <w:pPr>
+        <w:pStyle w:val="Caption"/>
+        <w:jc w:val="center"/>
+        <w:rPr>
+          <w:lang w:val="en-US"/>
+        </w:rPr>
+      </w:pPr>
+      <w:r>
+        <w:t xml:space="preserve">pav. </w:t>
+      </w:r>
+      <w:r>
+        <w:fldChar w:fldCharType="begin"/>
+      </w:r>
+      <w:r>
+        <w:instrText xml:space="preserve"> SEQ pav. \* ARABIC </w:instrText>
+      </w:r>
+      <w:r>
+        <w:fldChar w:fldCharType="separate"/>
+      </w:r>
+      <w:r>
+        <w:t>3</w:t>
+      </w:r>
+      <w:r>
+        <w:fldChar w:fldCharType="end"/>
+      </w:r>
+      <w:r>
+        <w:t xml:space="preserve"> nelygybinio apribojimo funkcijos</w:t>
+      </w:r>
+    </w:p>
+    <w:p>
+      <w:pPr>
         <w:pStyle w:val="ISITekstas"/>
         <w:jc w:val="center"/>
         <w:rPr>
@@ -1638,6 +1733,8 @@
     <w:p>
       <w:pPr>
         <w:pStyle w:val="ISITekstas"/>
+        <w:keepNext/>
+        <w:ind w:firstLine="0"/>
         <w:jc w:val="center"/>
       </w:pPr>
       <w:r>
@@ -1680,6 +1777,33 @@
     </w:p>
     <w:p>
       <w:pPr>
+        <w:pStyle w:val="Caption"/>
+        <w:jc w:val="center"/>
+      </w:pPr>
+      <w:r>
+        <w:t xml:space="preserve">pav. </w:t>
+      </w:r>
+      <w:r>
+        <w:fldChar w:fldCharType="begin"/>
+      </w:r>
+      <w:r>
+        <w:instrText xml:space="preserve"> SEQ pav. \* ARABIC </w:instrText>
+      </w:r>
+      <w:r>
+        <w:fldChar w:fldCharType="separate"/>
+      </w:r>
+      <w:r>
+        <w:t>4</w:t>
+      </w:r>
+      <w:r>
+        <w:fldChar w:fldCharType="end"/>
+      </w:r>
+      <w:r>
+        <w:t xml:space="preserve"> mano studento skaitmenys</w:t>
+      </w:r>
+    </w:p>
+    <w:p>
+      <w:pPr>
         <w:pStyle w:val="ISITekstas"/>
         <w:jc w:val="center"/>
         <w:rPr>
@@ -1913,10 +2037,9 @@
     <w:p>
       <w:pPr>
         <w:pStyle w:val="ISITekstas"/>
+        <w:keepNext/>
+        <w:ind w:firstLine="0"/>
         <w:jc w:val="center"/>
-        <w:rPr>
-          <w:lang w:val="en-US"/>
-        </w:rPr>
       </w:pPr>
       <w:r>
         <w:drawing>
@@ -1958,6 +2081,66 @@
     </w:p>
     <w:p>
       <w:pPr>
+        <w:pStyle w:val="Caption"/>
+        <w:jc w:val="center"/>
+        <w:rPr>
+          <w:lang w:val="en-US"/>
+        </w:rPr>
+      </w:pPr>
+      <w:r>
+        <w:t xml:space="preserve">pav. </w:t>
+      </w:r>
+      <w:r>
+        <w:fldChar w:fldCharType="begin"/>
+      </w:r>
+      <w:r>
+        <w:instrText xml:space="preserve"> SEQ pav. \* ARABIC </w:instrText>
+      </w:r>
+      <w:r>
+        <w:fldChar w:fldCharType="separate"/>
+      </w:r>
+      <w:r>
+        <w:t>5</w:t>
+      </w:r>
+      <w:r>
+        <w:fldChar w:fldCharType="end"/>
+      </w:r>
+      <w:r>
+        <w:t xml:space="preserve"> funkcijų reikšmės taškuose </w:t>
+      </w:r>
+      <w:r>
+        <w:t>X</w:t>
+      </w:r>
+      <w:r>
+        <w:rPr>
+          <w:vertAlign w:val="subscript"/>
+        </w:rPr>
+        <w:t>0</w:t>
+      </w:r>
+      <w:r>
+        <w:t>, X</w:t>
+      </w:r>
+      <w:r>
+        <w:rPr>
+          <w:vertAlign w:val="subscript"/>
+        </w:rPr>
+        <w:t>1</w:t>
+      </w:r>
+      <w:r>
+        <w:t xml:space="preserve"> ir </w:t>
+      </w:r>
+      <w:r>
+        <w:t>X</w:t>
+      </w:r>
+      <w:r>
+        <w:rPr>
+          <w:vertAlign w:val="subscript"/>
+        </w:rPr>
+        <w:t>m</w:t>
+      </w:r>
+    </w:p>
+    <w:p>
+      <w:pPr>
         <w:pStyle w:val="ISITekstas"/>
         <w:jc w:val="center"/>
         <w:rPr>
@@ -3058,10 +3241,9 @@
     <w:p>
       <w:pPr>
         <w:pStyle w:val="ISITekstas"/>
+        <w:keepNext/>
+        <w:ind w:firstLine="0"/>
         <w:jc w:val="center"/>
-        <w:rPr>
-          <w:iCs/>
-        </w:rPr>
       </w:pPr>
       <w:r>
         <w:drawing>
@@ -3103,6 +3285,36 @@
     </w:p>
     <w:p>
       <w:pPr>
+        <w:pStyle w:val="Caption"/>
+        <w:jc w:val="center"/>
+        <w:rPr>
+          <w:iCs w:val="0"/>
+        </w:rPr>
+      </w:pPr>
+      <w:r>
+        <w:t xml:space="preserve">pav. </w:t>
+      </w:r>
+      <w:r>
+        <w:fldChar w:fldCharType="begin"/>
+      </w:r>
+      <w:r>
+        <w:instrText xml:space="preserve"> SEQ pav. \* ARABIC </w:instrText>
+      </w:r>
+      <w:r>
+        <w:fldChar w:fldCharType="separate"/>
+      </w:r>
+      <w:r>
+        <w:t>6</w:t>
+      </w:r>
+      <w:r>
+        <w:fldChar w:fldCharType="end"/>
+      </w:r>
+      <w:r>
+        <w:t xml:space="preserve"> baudos funkcija</w:t>
+      </w:r>
+    </w:p>
+    <w:p>
+      <w:pPr>
         <w:pStyle w:val="ISITekstas"/>
         <w:jc w:val="center"/>
       </w:pPr>
@@ -3159,10 +3371,9 @@
     <w:p>
       <w:pPr>
         <w:pStyle w:val="ISITekstas"/>
+        <w:keepNext/>
+        <w:ind w:firstLine="0"/>
         <w:jc w:val="center"/>
-        <w:rPr>
-          <w:lang w:val="en-US"/>
-        </w:rPr>
       </w:pPr>
       <w:r>
         <w:drawing>
@@ -3204,6 +3415,36 @@
     </w:p>
     <w:p>
       <w:pPr>
+        <w:pStyle w:val="Caption"/>
+        <w:jc w:val="center"/>
+        <w:rPr>
+          <w:lang w:val="en-US"/>
+        </w:rPr>
+      </w:pPr>
+      <w:r>
+        <w:t xml:space="preserve">pav. </w:t>
+      </w:r>
+      <w:r>
+        <w:fldChar w:fldCharType="begin"/>
+      </w:r>
+      <w:r>
+        <w:instrText xml:space="preserve"> SEQ pav. \* ARABIC </w:instrText>
+      </w:r>
+      <w:r>
+        <w:fldChar w:fldCharType="separate"/>
+      </w:r>
+      <w:r>
+        <w:t>7</w:t>
+      </w:r>
+      <w:r>
+        <w:fldChar w:fldCharType="end"/>
+      </w:r>
+      <w:r>
+        <w:t xml:space="preserve"> baudos funkcijos sprendiniai su įvairiomis r reikšmėmis</w:t>
+      </w:r>
+    </w:p>
+    <w:p>
+      <w:pPr>
         <w:pStyle w:val="ISITekstas"/>
         <w:jc w:val="center"/>
         <w:rPr>
@@ -3316,9 +3557,168 @@
     <w:p>
       <w:pPr>
         <w:pStyle w:val="ISITekstas"/>
-        <w:rPr>
-          <w:lang w:val="en-US"/>
-        </w:rPr>
+      </w:pPr>
+      <w:r>
+        <w:t xml:space="preserve">Modifikavau ankstesniame laboratoriniame darbe implementuotą greičiausiojo nusileidimo algoritmą darbui su 3 kintamaisiais bei apskaičiavau funkcijos gradientą (žr. ). </w:t>
+      </w:r>
+      <w:r>
+        <w:t>Su modifikuotu algoritmu, optimizavau baudos funkciją pagal nurodytą tvarką (žr. )</w:t>
+      </w:r>
+    </w:p>
+    <w:p>
+      <w:pPr>
+        <w:pStyle w:val="ISITekstas"/>
+        <w:keepNext/>
+        <w:ind w:firstLine="0"/>
+        <w:jc w:val="center"/>
+      </w:pPr>
+      <w:r>
+        <w:drawing>
+          <wp:inline distT="0" distB="0" distL="0" distR="0" wp14:anchorId="314539FC" wp14:editId="376D9816">
+            <wp:extent cx="3596232" cy="3213654"/>
+            <wp:effectExtent l="0" t="0" r="4445" b="6350"/>
+            <wp:docPr id="188999791" name="Picture 1"/>
+            <wp:cNvGraphicFramePr>
+              <a:graphicFrameLocks xmlns:a="http://schemas.openxmlformats.org/drawingml/2006/main" noChangeAspect="1"/>
+            </wp:cNvGraphicFramePr>
+            <a:graphic xmlns:a="http://schemas.openxmlformats.org/drawingml/2006/main">
+              <a:graphicData uri="http://schemas.openxmlformats.org/drawingml/2006/picture">
+                <pic:pic xmlns:pic="http://schemas.openxmlformats.org/drawingml/2006/picture">
+                  <pic:nvPicPr>
+                    <pic:cNvPr id="188999791" name=""/>
+                    <pic:cNvPicPr/>
+                  </pic:nvPicPr>
+                  <pic:blipFill>
+                    <a:blip r:embed="rId18"/>
+                    <a:stretch>
+                      <a:fillRect/>
+                    </a:stretch>
+                  </pic:blipFill>
+                  <pic:spPr>
+                    <a:xfrm>
+                      <a:off x="0" y="0"/>
+                      <a:ext cx="3604109" cy="3220693"/>
+                    </a:xfrm>
+                    <a:prstGeom prst="rect">
+                      <a:avLst/>
+                    </a:prstGeom>
+                  </pic:spPr>
+                </pic:pic>
+              </a:graphicData>
+            </a:graphic>
+          </wp:inline>
+        </w:drawing>
+      </w:r>
+    </w:p>
+    <w:p>
+      <w:pPr>
+        <w:pStyle w:val="Caption"/>
+        <w:jc w:val="center"/>
+      </w:pPr>
+      <w:r>
+        <w:t xml:space="preserve">pav. </w:t>
+      </w:r>
+      <w:r>
+        <w:fldChar w:fldCharType="begin"/>
+      </w:r>
+      <w:r>
+        <w:instrText xml:space="preserve"> SEQ pav. \* ARABIC </w:instrText>
+      </w:r>
+      <w:r>
+        <w:fldChar w:fldCharType="separate"/>
+      </w:r>
+      <w:r>
+        <w:t>8</w:t>
+      </w:r>
+      <w:r>
+        <w:fldChar w:fldCharType="end"/>
+      </w:r>
+      <w:r>
+        <w:t xml:space="preserve"> baudos funkcijos gradientas</w:t>
+      </w:r>
+    </w:p>
+    <w:p>
+      <w:pPr>
+        <w:pStyle w:val="ISITekstas"/>
+        <w:jc w:val="center"/>
+      </w:pPr>
+    </w:p>
+    <w:p>
+      <w:pPr>
+        <w:pStyle w:val="ISITekstas"/>
+        <w:keepNext/>
+        <w:ind w:firstLine="0"/>
+        <w:jc w:val="center"/>
+      </w:pPr>
+      <w:r>
+        <w:drawing>
+          <wp:inline distT="0" distB="0" distL="0" distR="0" wp14:anchorId="01FE3F2B" wp14:editId="68751B2E">
+            <wp:extent cx="3431068" cy="2551710"/>
+            <wp:effectExtent l="0" t="0" r="0" b="1270"/>
+            <wp:docPr id="803885188" name="Picture 1"/>
+            <wp:cNvGraphicFramePr>
+              <a:graphicFrameLocks xmlns:a="http://schemas.openxmlformats.org/drawingml/2006/main" noChangeAspect="1"/>
+            </wp:cNvGraphicFramePr>
+            <a:graphic xmlns:a="http://schemas.openxmlformats.org/drawingml/2006/main">
+              <a:graphicData uri="http://schemas.openxmlformats.org/drawingml/2006/picture">
+                <pic:pic xmlns:pic="http://schemas.openxmlformats.org/drawingml/2006/picture">
+                  <pic:nvPicPr>
+                    <pic:cNvPr id="803885188" name=""/>
+                    <pic:cNvPicPr/>
+                  </pic:nvPicPr>
+                  <pic:blipFill>
+                    <a:blip r:embed="rId19"/>
+                    <a:stretch>
+                      <a:fillRect/>
+                    </a:stretch>
+                  </pic:blipFill>
+                  <pic:spPr>
+                    <a:xfrm>
+                      <a:off x="0" y="0"/>
+                      <a:ext cx="3436795" cy="2555969"/>
+                    </a:xfrm>
+                    <a:prstGeom prst="rect">
+                      <a:avLst/>
+                    </a:prstGeom>
+                  </pic:spPr>
+                </pic:pic>
+              </a:graphicData>
+            </a:graphic>
+          </wp:inline>
+        </w:drawing>
+      </w:r>
+    </w:p>
+    <w:p>
+      <w:pPr>
+        <w:pStyle w:val="Caption"/>
+        <w:jc w:val="center"/>
+      </w:pPr>
+      <w:r>
+        <w:t xml:space="preserve">pav. </w:t>
+      </w:r>
+      <w:r>
+        <w:fldChar w:fldCharType="begin"/>
+      </w:r>
+      <w:r>
+        <w:instrText xml:space="preserve"> SEQ pav. \* ARABIC </w:instrText>
+      </w:r>
+      <w:r>
+        <w:fldChar w:fldCharType="separate"/>
+      </w:r>
+      <w:r>
+        <w:t>9</w:t>
+      </w:r>
+      <w:r>
+        <w:fldChar w:fldCharType="end"/>
+      </w:r>
+      <w:r>
+        <w:t xml:space="preserve"> baudos funkcijos minimizavimo žingsniai</w:t>
+      </w:r>
+    </w:p>
+    <w:p>
+      <w:pPr>
+        <w:pStyle w:val="ISITekstas"/>
+        <w:jc w:val="center"/>
       </w:pPr>
     </w:p>
     <w:p>
@@ -3335,13 +3735,310 @@
     <w:p>
       <w:pPr>
         <w:pStyle w:val="ISITekstas"/>
-        <w:rPr>
-          <w:lang w:val="en-US"/>
-        </w:rPr>
-      </w:pPr>
+      </w:pPr>
+      <w:r>
+        <w:rPr>
+          <w:lang w:val="en-US"/>
+        </w:rPr>
+        <w:t xml:space="preserve">Atlikau minimizavimą su taškais </w:t>
+      </w:r>
+      <w:r>
+        <w:rPr>
+          <w:i/>
+          <w:iCs/>
+        </w:rPr>
+        <w:t>X</w:t>
+      </w:r>
+      <w:r>
+        <w:rPr>
+          <w:vertAlign w:val="subscript"/>
+        </w:rPr>
+        <w:t>0</w:t>
+      </w:r>
+      <w:r>
+        <w:t xml:space="preserve">, </w:t>
+      </w:r>
+      <w:r>
+        <w:rPr>
+          <w:i/>
+          <w:iCs/>
+        </w:rPr>
+        <w:t>X</w:t>
+      </w:r>
+      <w:r>
+        <w:rPr>
+          <w:vertAlign w:val="subscript"/>
+        </w:rPr>
+        <w:t>1</w:t>
+      </w:r>
+      <w:r>
+        <w:t xml:space="preserve"> ir X</w:t>
+      </w:r>
+      <w:r>
+        <w:rPr>
+          <w:i/>
+          <w:iCs/>
+          <w:vertAlign w:val="subscript"/>
+        </w:rPr>
+        <w:t>m</w:t>
+      </w:r>
+      <w:r>
+        <w:t xml:space="preserve"> (žr. )</w:t>
+      </w:r>
+    </w:p>
+    <w:p>
+      <w:pPr>
+        <w:pStyle w:val="ISITekstas"/>
+        <w:rPr>
+          <w:lang w:val="en-US"/>
+        </w:rPr>
+      </w:pPr>
+      <w:r>
+        <w:rPr>
+          <w:lang w:val="en-US"/>
+        </w:rPr>
+        <w:t>Pastebėjimai:</w:t>
+      </w:r>
+    </w:p>
+    <w:p>
+      <w:pPr>
+        <w:pStyle w:val="ISISraas"/>
+        <w:rPr>
+          <w:lang w:val="en-US"/>
+        </w:rPr>
+      </w:pPr>
+      <w:r>
+        <w:t>Pradėjus iš X</w:t>
+      </w:r>
+      <w:r>
+        <w:rPr>
+          <w:vertAlign w:val="subscript"/>
+        </w:rPr>
+        <w:t>0</w:t>
+      </w:r>
+      <w:r>
+        <w:t xml:space="preserve">, </w:t>
+      </w:r>
+      <w:r>
+        <w:t xml:space="preserve">gradientinis metodas sustoja iš karto, nes </w:t>
+      </w:r>
+      <w:r>
+        <w:rPr>
+          <w:rFonts w:ascii="Cambria Math" w:hAnsi="Cambria Math" w:cs="Cambria Math"/>
+        </w:rPr>
+        <w:t>∇</w:t>
+      </w:r>
+      <w:r>
+        <w:t>B(X</w:t>
+      </w:r>
+      <w:r>
+        <w:rPr>
+          <w:vertAlign w:val="subscript"/>
+        </w:rPr>
+        <w:t>0</w:t>
+      </w:r>
+      <w:r>
+        <w:t>,</w:t>
+      </w:r>
+      <w:r>
+        <w:t xml:space="preserve"> </w:t>
+      </w:r>
+      <w:r>
+        <w:t>r)</w:t>
+      </w:r>
+      <w:r>
+        <w:t xml:space="preserve"> </w:t>
+      </w:r>
+      <w:r>
+        <w:t>=</w:t>
+      </w:r>
+      <w:r>
+        <w:t xml:space="preserve"> </w:t>
+      </w:r>
+      <w:r>
+        <w:t>0</w:t>
+      </w:r>
+      <w:r>
+        <w:t>. Š</w:t>
+      </w:r>
+      <w:r>
+        <w:t>is taškas nėra leistinas, nes g(X</w:t>
+      </w:r>
+      <w:r>
+        <w:rPr>
+          <w:vertAlign w:val="subscript"/>
+        </w:rPr>
+        <w:t>0</w:t>
+      </w:r>
+      <w:r>
+        <w:t>)</w:t>
+      </w:r>
+      <w:r>
+        <w:t xml:space="preserve"> </w:t>
+      </w:r>
+      <w:r>
+        <w:t>=</w:t>
+      </w:r>
+      <w:r>
+        <w:t xml:space="preserve"> </w:t>
+      </w:r>
+      <w:r>
+        <w:t>−1</w:t>
+      </w:r>
+      <w:r>
+        <w:t>, t.y. įvesties taškas neleistinas</w:t>
+      </w:r>
+    </w:p>
+    <w:p>
+      <w:pPr>
+        <w:pStyle w:val="ISISraas"/>
+        <w:rPr>
+          <w:lang w:val="en-US"/>
+        </w:rPr>
+      </w:pPr>
+      <w:r>
+        <w:t>Pradėjus iš X</w:t>
+      </w:r>
+      <w:r>
+        <w:rPr>
+          <w:vertAlign w:val="subscript"/>
+        </w:rPr>
+        <w:t>1</w:t>
+      </w:r>
+      <w:r>
+        <w:t>, gradientinis metodas teisingai randa tašką, apskaičiuodamas su labai maža (~0) paklaida. Apskaičiavimui prireikia 21 iteracijos ir 626 funkcijos skaičiavimų</w:t>
+      </w:r>
+    </w:p>
+    <w:p>
+      <w:pPr>
+        <w:pStyle w:val="ISISraas"/>
+        <w:rPr>
+          <w:lang w:val="en-US"/>
+        </w:rPr>
+      </w:pPr>
+      <w:r>
+        <w:t>Pradėjus iš X</w:t>
+      </w:r>
+      <w:r>
+        <w:rPr>
+          <w:vertAlign w:val="subscript"/>
+        </w:rPr>
+        <w:t>m</w:t>
+      </w:r>
+      <w:r>
+        <w:t>, gradientinis metodas</w:t>
+      </w:r>
+    </w:p>
+    <w:p>
+      <w:pPr>
+        <w:pStyle w:val="ISITekstas"/>
+        <w:keepNext/>
+        <w:ind w:firstLine="0"/>
+        <w:jc w:val="center"/>
+      </w:pPr>
+      <w:r>
+        <w:drawing>
+          <wp:inline distT="0" distB="0" distL="0" distR="0" wp14:anchorId="21F52C4A" wp14:editId="5BD62CFB">
+            <wp:extent cx="5331638" cy="1688794"/>
+            <wp:effectExtent l="0" t="0" r="2540" b="6985"/>
+            <wp:docPr id="338865331" name="Picture 1"/>
+            <wp:cNvGraphicFramePr>
+              <a:graphicFrameLocks xmlns:a="http://schemas.openxmlformats.org/drawingml/2006/main" noChangeAspect="1"/>
+            </wp:cNvGraphicFramePr>
+            <a:graphic xmlns:a="http://schemas.openxmlformats.org/drawingml/2006/main">
+              <a:graphicData uri="http://schemas.openxmlformats.org/drawingml/2006/picture">
+                <pic:pic xmlns:pic="http://schemas.openxmlformats.org/drawingml/2006/picture">
+                  <pic:nvPicPr>
+                    <pic:cNvPr id="338865331" name=""/>
+                    <pic:cNvPicPr/>
+                  </pic:nvPicPr>
+                  <pic:blipFill>
+                    <a:blip r:embed="rId20"/>
+                    <a:stretch>
+                      <a:fillRect/>
+                    </a:stretch>
+                  </pic:blipFill>
+                  <pic:spPr>
+                    <a:xfrm>
+                      <a:off x="0" y="0"/>
+                      <a:ext cx="5334859" cy="1689814"/>
+                    </a:xfrm>
+                    <a:prstGeom prst="rect">
+                      <a:avLst/>
+                    </a:prstGeom>
+                  </pic:spPr>
+                </pic:pic>
+              </a:graphicData>
+            </a:graphic>
+          </wp:inline>
+        </w:drawing>
+      </w:r>
+    </w:p>
+    <w:p>
+      <w:pPr>
+        <w:pStyle w:val="Caption"/>
+        <w:jc w:val="center"/>
+        <w:rPr>
+          <w:lang w:val="en-US"/>
+        </w:rPr>
+      </w:pPr>
+      <w:r>
+        <w:t xml:space="preserve">pav. </w:t>
+      </w:r>
+      <w:r>
+        <w:fldChar w:fldCharType="begin"/>
+      </w:r>
+      <w:r>
+        <w:instrText xml:space="preserve"> SEQ pav. \* ARABIC </w:instrText>
+      </w:r>
+      <w:r>
+        <w:fldChar w:fldCharType="separate"/>
+      </w:r>
+      <w:r>
+        <w:t>10</w:t>
+      </w:r>
+      <w:r>
+        <w:fldChar w:fldCharType="end"/>
+      </w:r>
+      <w:r>
+        <w:t xml:space="preserve"> galutiniai rezultatai taškuose</w:t>
+      </w:r>
+      <w:r>
+        <w:t xml:space="preserve"> </w:t>
+      </w:r>
+      <w:r>
+        <w:t>X</w:t>
+      </w:r>
+      <w:r>
+        <w:rPr>
+          <w:vertAlign w:val="subscript"/>
+        </w:rPr>
+        <w:t>0</w:t>
+      </w:r>
+      <w:r>
+        <w:t>, X</w:t>
+      </w:r>
+      <w:r>
+        <w:rPr>
+          <w:vertAlign w:val="subscript"/>
+        </w:rPr>
+        <w:t>1</w:t>
+      </w:r>
+      <w:r>
+        <w:t xml:space="preserve"> ir </w:t>
+      </w:r>
+      <w:r>
+        <w:t>X</w:t>
+      </w:r>
+      <w:r>
+        <w:rPr>
+          <w:vertAlign w:val="subscript"/>
+        </w:rPr>
+        <w:t>m</w:t>
+      </w:r>
     </w:p>
     <w:sectPr>
-      <w:footerReference w:type="default" r:id="rId18"/>
+      <w:footerReference w:type="default" r:id="rId21"/>
       <w:pgSz w:w="11906" w:h="16838"/>
       <w:pgMar w:top="1021" w:right="1021" w:bottom="1021" w:left="1588" w:header="567" w:footer="567" w:gutter="0"/>
       <w:pgNumType w:start="3"/>

</xml_diff>

<commit_message>
3LD: Galutiniai pakeitimai bei pataisymai
</commit_message>
<xml_diff>
--- a/3LD/3LD.docx
+++ b/3LD/3LD.docx
@@ -412,6 +412,7 @@
         <w:pStyle w:val="ISIAntrat10"/>
       </w:pPr>
       <w:r>
+        <w:lastRenderedPageBreak/>
         <w:t>Užduotis</w:t>
       </w:r>
     </w:p>
@@ -596,21 +597,7 @@
           <w:i/>
           <w:iCs/>
         </w:rPr>
-        <w:t>„</w:t>
-      </w:r>
-      <w:r>
-        <w:rPr>
-          <w:i/>
-          <w:iCs/>
-        </w:rPr>
-        <w:t>Kokia turėtų būti stačiakampio gretasienio formos dėžė, kad vienetiniam paviršiaus plotui jos tūris būtų maksimalus?</w:t>
-      </w:r>
-      <w:r>
-        <w:rPr>
-          <w:i/>
-          <w:iCs/>
-        </w:rPr>
-        <w:t>“</w:t>
+        <w:t>„Kokia turėtų būti stačiakampio gretasienio formos dėžė, kad vienetiniam paviršiaus plotui jos tūris būtų maksimalus?“</w:t>
       </w:r>
       <w:r>
         <w:t>.</w:t>
@@ -713,10 +700,10 @@
         <w:t>1</w:t>
       </w:r>
       <w:r>
-        <w:t xml:space="preserve">, </w:t>
-      </w:r>
-      <w:r>
-        <w:t xml:space="preserve">0, </w:t>
+        <w:t>,</w:t>
+      </w:r>
+      <w:r>
+        <w:t xml:space="preserve"> </w:t>
       </w:r>
       <w:r>
         <w:t xml:space="preserve">o kadangi dėžės matmenys </w:t>
@@ -1285,10 +1272,25 @@
         <w:t>implementavau tikslo funkciją</w:t>
       </w:r>
       <w:r>
-        <w:t xml:space="preserve"> </w:t>
-      </w:r>
-      <w:r>
-        <w:t>(žr. )</w:t>
+        <w:t xml:space="preserve"> (žr. </w:t>
+      </w:r>
+      <w:r>
+        <w:fldChar w:fldCharType="begin"/>
+      </w:r>
+      <w:r>
+        <w:instrText xml:space="preserve"> REF _Ref228485309 \h </w:instrText>
+      </w:r>
+      <w:r>
+        <w:fldChar w:fldCharType="separate"/>
+      </w:r>
+      <w:r>
+        <w:t>pav. 1</w:t>
+      </w:r>
+      <w:r>
+        <w:fldChar w:fldCharType="end"/>
+      </w:r>
+      <w:r>
+        <w:t>)</w:t>
       </w:r>
       <w:r>
         <w:t xml:space="preserve"> bei lygybin</w:t>
@@ -1297,10 +1299,25 @@
         <w:t>į</w:t>
       </w:r>
       <w:r>
-        <w:t xml:space="preserve"> </w:t>
-      </w:r>
-      <w:r>
-        <w:t>(žr. )</w:t>
+        <w:t xml:space="preserve"> (žr. </w:t>
+      </w:r>
+      <w:r>
+        <w:fldChar w:fldCharType="begin"/>
+      </w:r>
+      <w:r>
+        <w:instrText xml:space="preserve"> REF _Ref228485314 \h </w:instrText>
+      </w:r>
+      <w:r>
+        <w:fldChar w:fldCharType="separate"/>
+      </w:r>
+      <w:r>
+        <w:t>pav. 2</w:t>
+      </w:r>
+      <w:r>
+        <w:fldChar w:fldCharType="end"/>
+      </w:r>
+      <w:r>
+        <w:t>)</w:t>
       </w:r>
       <w:r>
         <w:t xml:space="preserve"> ir nelygybini</w:t>
@@ -1309,8 +1326,32 @@
         <w:t>us</w:t>
       </w:r>
       <w:r>
-        <w:t xml:space="preserve"> apribojimus (žr. )</w:t>
-      </w:r>
+        <w:t xml:space="preserve"> apribojimus (žr. </w:t>
+      </w:r>
+      <w:r>
+        <w:fldChar w:fldCharType="begin"/>
+      </w:r>
+      <w:r>
+        <w:instrText xml:space="preserve"> REF _Ref228485317 \h </w:instrText>
+      </w:r>
+      <w:r>
+        <w:fldChar w:fldCharType="separate"/>
+      </w:r>
+      <w:r>
+        <w:t>pav. 3</w:t>
+      </w:r>
+      <w:r>
+        <w:fldChar w:fldCharType="end"/>
+      </w:r>
+      <w:r>
+        <w:t>)</w:t>
+      </w:r>
+    </w:p>
+    <w:p>
+      <w:pPr>
+        <w:pStyle w:val="ISITekstas"/>
+        <w:jc w:val="center"/>
+      </w:pPr>
     </w:p>
     <w:p>
       <w:pPr>
@@ -1321,9 +1362,9 @@
       </w:pPr>
       <w:r>
         <w:drawing>
-          <wp:inline distT="0" distB="0" distL="0" distR="0" wp14:anchorId="001CDF1A" wp14:editId="0D94CA59">
-            <wp:extent cx="2942006" cy="1153062"/>
-            <wp:effectExtent l="0" t="0" r="0" b="9525"/>
+          <wp:inline distT="0" distB="0" distL="0" distR="0" wp14:anchorId="001CDF1A" wp14:editId="7115C503">
+            <wp:extent cx="2525406" cy="989784"/>
+            <wp:effectExtent l="0" t="0" r="8255" b="1270"/>
             <wp:docPr id="1565700765" name="Picture 1"/>
             <wp:cNvGraphicFramePr>
               <a:graphicFrameLocks xmlns:a="http://schemas.openxmlformats.org/drawingml/2006/main" noChangeAspect="1"/>
@@ -1344,7 +1385,7 @@
                   <pic:spPr>
                     <a:xfrm>
                       <a:off x="0" y="0"/>
-                      <a:ext cx="2955027" cy="1158165"/>
+                      <a:ext cx="2548438" cy="998811"/>
                     </a:xfrm>
                     <a:prstGeom prst="rect">
                       <a:avLst/>
@@ -1365,6 +1406,7 @@
           <w:lang w:val="en-US"/>
         </w:rPr>
       </w:pPr>
+      <w:bookmarkStart w:id="0" w:name="_Ref228485309"/>
       <w:r>
         <w:t xml:space="preserve">pav. </w:t>
       </w:r>
@@ -1383,6 +1425,7 @@
       <w:r>
         <w:fldChar w:fldCharType="end"/>
       </w:r>
+      <w:bookmarkEnd w:id="0"/>
       <w:r>
         <w:t xml:space="preserve"> tikslo funkcija</w:t>
       </w:r>
@@ -1405,9 +1448,9 @@
       </w:pPr>
       <w:r>
         <w:drawing>
-          <wp:inline distT="0" distB="0" distL="0" distR="0" wp14:anchorId="15D9C284" wp14:editId="26605F71">
-            <wp:extent cx="3100272" cy="697152"/>
-            <wp:effectExtent l="0" t="0" r="5080" b="8255"/>
+          <wp:inline distT="0" distB="0" distL="0" distR="0" wp14:anchorId="15D9C284" wp14:editId="1153E51F">
+            <wp:extent cx="2719530" cy="611536"/>
+            <wp:effectExtent l="0" t="0" r="5080" b="0"/>
             <wp:docPr id="1540373597" name="Picture 1"/>
             <wp:cNvGraphicFramePr>
               <a:graphicFrameLocks xmlns:a="http://schemas.openxmlformats.org/drawingml/2006/main" noChangeAspect="1"/>
@@ -1428,7 +1471,7 @@
                   <pic:spPr>
                     <a:xfrm>
                       <a:off x="0" y="0"/>
-                      <a:ext cx="3112338" cy="699865"/>
+                      <a:ext cx="2752569" cy="618965"/>
                     </a:xfrm>
                     <a:prstGeom prst="rect">
                       <a:avLst/>
@@ -1449,6 +1492,7 @@
           <w:lang w:val="en-US"/>
         </w:rPr>
       </w:pPr>
+      <w:bookmarkStart w:id="1" w:name="_Ref228485314"/>
       <w:r>
         <w:t xml:space="preserve">pav. </w:t>
       </w:r>
@@ -1467,6 +1511,7 @@
       <w:r>
         <w:fldChar w:fldCharType="end"/>
       </w:r>
+      <w:bookmarkEnd w:id="1"/>
       <w:r>
         <w:t xml:space="preserve"> lygybinio apribojimo funkcija</w:t>
       </w:r>
@@ -1488,10 +1533,11 @@
         <w:jc w:val="center"/>
       </w:pPr>
       <w:r>
+        <w:lastRenderedPageBreak/>
         <w:drawing>
-          <wp:inline distT="0" distB="0" distL="0" distR="0" wp14:anchorId="3783A654" wp14:editId="075BFCAC">
-            <wp:extent cx="2006498" cy="1891372"/>
-            <wp:effectExtent l="0" t="0" r="0" b="0"/>
+          <wp:inline distT="0" distB="0" distL="0" distR="0" wp14:anchorId="3783A654" wp14:editId="1EB35183">
+            <wp:extent cx="1855796" cy="1749316"/>
+            <wp:effectExtent l="0" t="0" r="0" b="3810"/>
             <wp:docPr id="1111689684" name="Picture 1"/>
             <wp:cNvGraphicFramePr>
               <a:graphicFrameLocks xmlns:a="http://schemas.openxmlformats.org/drawingml/2006/main" noChangeAspect="1"/>
@@ -1512,7 +1558,7 @@
                   <pic:spPr>
                     <a:xfrm>
                       <a:off x="0" y="0"/>
-                      <a:ext cx="2012735" cy="1897251"/>
+                      <a:ext cx="1866182" cy="1759106"/>
                     </a:xfrm>
                     <a:prstGeom prst="rect">
                       <a:avLst/>
@@ -1533,6 +1579,7 @@
           <w:lang w:val="en-US"/>
         </w:rPr>
       </w:pPr>
+      <w:bookmarkStart w:id="2" w:name="_Ref228485317"/>
       <w:r>
         <w:t xml:space="preserve">pav. </w:t>
       </w:r>
@@ -1551,184 +1598,200 @@
       <w:r>
         <w:fldChar w:fldCharType="end"/>
       </w:r>
+      <w:bookmarkEnd w:id="2"/>
       <w:r>
         <w:t xml:space="preserve"> nelygybinio apribojimo funkcijos</w:t>
+      </w:r>
+    </w:p>
+    <w:p>
+      <w:pPr>
+        <w:pStyle w:val="ISIAntrat1"/>
+        <w:rPr>
+          <w:lang w:val="en-US"/>
+        </w:rPr>
+      </w:pPr>
+      <w:r>
+        <w:t xml:space="preserve">Apskaičiuokite funkcijų </w:t>
+      </w:r>
+      <w:r>
+        <w:rPr>
+          <w:i/>
+          <w:iCs/>
+        </w:rPr>
+        <w:t>f</w:t>
+      </w:r>
+      <w:r>
+        <w:t>(</w:t>
+      </w:r>
+      <w:r>
+        <w:rPr>
+          <w:i/>
+          <w:iCs/>
+        </w:rPr>
+        <w:t>X</w:t>
+      </w:r>
+      <w:r>
+        <w:t xml:space="preserve">), </w:t>
+      </w:r>
+      <w:r>
+        <w:rPr>
+          <w:i/>
+          <w:iCs/>
+        </w:rPr>
+        <w:t>g</w:t>
+      </w:r>
+      <w:r>
+        <w:rPr>
+          <w:i/>
+          <w:iCs/>
+          <w:vertAlign w:val="subscript"/>
+        </w:rPr>
+        <w:t>i</w:t>
+      </w:r>
+      <w:r>
+        <w:t>(</w:t>
+      </w:r>
+      <w:r>
+        <w:rPr>
+          <w:i/>
+          <w:iCs/>
+        </w:rPr>
+        <w:t>X</w:t>
+      </w:r>
+      <w:r>
+        <w:t xml:space="preserve">), </w:t>
+      </w:r>
+      <w:r>
+        <w:rPr>
+          <w:i/>
+          <w:iCs/>
+        </w:rPr>
+        <w:t>h</w:t>
+      </w:r>
+      <w:r>
+        <w:rPr>
+          <w:i/>
+          <w:iCs/>
+          <w:vertAlign w:val="subscript"/>
+        </w:rPr>
+        <w:t>i</w:t>
+      </w:r>
+      <w:r>
+        <w:t>(</w:t>
+      </w:r>
+      <w:r>
+        <w:rPr>
+          <w:i/>
+          <w:iCs/>
+        </w:rPr>
+        <w:t>X</w:t>
+      </w:r>
+      <w:r>
+        <w:t xml:space="preserve">) reikšmes taškuose </w:t>
+      </w:r>
+      <w:r>
+        <w:rPr>
+          <w:i/>
+          <w:iCs/>
+        </w:rPr>
+        <w:t>X</w:t>
+      </w:r>
+      <w:r>
+        <w:rPr>
+          <w:vertAlign w:val="subscript"/>
+        </w:rPr>
+        <w:t>0</w:t>
+      </w:r>
+      <w:r>
+        <w:t xml:space="preserve">=(0,0,0), </w:t>
+      </w:r>
+      <w:r>
+        <w:rPr>
+          <w:i/>
+          <w:iCs/>
+        </w:rPr>
+        <w:t>X</w:t>
+      </w:r>
+      <w:r>
+        <w:rPr>
+          <w:vertAlign w:val="subscript"/>
+        </w:rPr>
+        <w:t>1</w:t>
+      </w:r>
+      <w:r>
+        <w:t xml:space="preserve">=(1,1,1) ir </w:t>
+      </w:r>
+      <w:r>
+        <w:rPr>
+          <w:i/>
+          <w:iCs/>
+        </w:rPr>
+        <w:t>X</w:t>
+      </w:r>
+      <w:r>
+        <w:rPr>
+          <w:i/>
+          <w:iCs/>
+          <w:vertAlign w:val="subscript"/>
+        </w:rPr>
+        <w:t>m</w:t>
+      </w:r>
+      <w:r>
+        <w:t>=(a/10,b/10,c/10), čia a,b,c – studento knygelės numerio “2x1xabc” skaitmenys.</w:t>
+      </w:r>
+    </w:p>
+    <w:p>
+      <w:pPr>
+        <w:pStyle w:val="ISITekstas"/>
+      </w:pPr>
+      <w:r>
+        <w:t>Pagal studento kodą, nustačiau A</w:t>
+      </w:r>
+      <w:r>
+        <w:t xml:space="preserve">, </w:t>
+      </w:r>
+      <w:r>
+        <w:t xml:space="preserve">B </w:t>
+      </w:r>
+      <w:r>
+        <w:t xml:space="preserve">ir C </w:t>
+      </w:r>
+      <w:r>
+        <w:t xml:space="preserve">reikšmes </w:t>
+      </w:r>
+      <w:r>
+        <w:t>9, 3 ir 9</w:t>
+      </w:r>
+      <w:r>
+        <w:t xml:space="preserve"> (žr. </w:t>
+      </w:r>
+      <w:r>
+        <w:fldChar w:fldCharType="begin"/>
+      </w:r>
+      <w:r>
+        <w:instrText xml:space="preserve"> REF _Ref228485323 \h </w:instrText>
+      </w:r>
+      <w:r>
+        <w:fldChar w:fldCharType="separate"/>
+      </w:r>
+      <w:r>
+        <w:t>pav. 4</w:t>
+      </w:r>
+      <w:r>
+        <w:fldChar w:fldCharType="end"/>
+      </w:r>
+      <w:r>
+        <w:t>)</w:t>
+      </w:r>
+      <w:r>
+        <w:t>.</w:t>
       </w:r>
     </w:p>
     <w:p>
       <w:pPr>
         <w:pStyle w:val="ISITekstas"/>
         <w:jc w:val="center"/>
-        <w:rPr>
-          <w:lang w:val="en-US"/>
-        </w:rPr>
-      </w:pPr>
-    </w:p>
-    <w:p>
-      <w:pPr>
-        <w:pStyle w:val="ISIAntrat1"/>
-        <w:rPr>
-          <w:lang w:val="en-US"/>
-        </w:rPr>
-      </w:pPr>
-      <w:r>
-        <w:t xml:space="preserve">Apskaičiuokite funkcijų </w:t>
-      </w:r>
-      <w:r>
-        <w:rPr>
-          <w:i/>
-          <w:iCs/>
-        </w:rPr>
-        <w:t>f</w:t>
-      </w:r>
-      <w:r>
-        <w:t>(</w:t>
-      </w:r>
-      <w:r>
-        <w:rPr>
-          <w:i/>
-          <w:iCs/>
-        </w:rPr>
-        <w:t>X</w:t>
-      </w:r>
-      <w:r>
-        <w:t xml:space="preserve">), </w:t>
-      </w:r>
-      <w:r>
-        <w:rPr>
-          <w:i/>
-          <w:iCs/>
-        </w:rPr>
-        <w:t>g</w:t>
-      </w:r>
-      <w:r>
-        <w:rPr>
-          <w:i/>
-          <w:iCs/>
-          <w:vertAlign w:val="subscript"/>
-        </w:rPr>
-        <w:t>i</w:t>
-      </w:r>
-      <w:r>
-        <w:t>(</w:t>
-      </w:r>
-      <w:r>
-        <w:rPr>
-          <w:i/>
-          <w:iCs/>
-        </w:rPr>
-        <w:t>X</w:t>
-      </w:r>
-      <w:r>
-        <w:t xml:space="preserve">), </w:t>
-      </w:r>
-      <w:r>
-        <w:rPr>
-          <w:i/>
-          <w:iCs/>
-        </w:rPr>
-        <w:t>h</w:t>
-      </w:r>
-      <w:r>
-        <w:rPr>
-          <w:i/>
-          <w:iCs/>
-          <w:vertAlign w:val="subscript"/>
-        </w:rPr>
-        <w:t>i</w:t>
-      </w:r>
-      <w:r>
-        <w:t>(</w:t>
-      </w:r>
-      <w:r>
-        <w:rPr>
-          <w:i/>
-          <w:iCs/>
-        </w:rPr>
-        <w:t>X</w:t>
-      </w:r>
-      <w:r>
-        <w:t xml:space="preserve">) reikšmes taškuose </w:t>
-      </w:r>
-      <w:r>
-        <w:rPr>
-          <w:i/>
-          <w:iCs/>
-        </w:rPr>
-        <w:t>X</w:t>
-      </w:r>
-      <w:r>
-        <w:rPr>
-          <w:vertAlign w:val="subscript"/>
-        </w:rPr>
-        <w:t>0</w:t>
-      </w:r>
-      <w:r>
-        <w:t xml:space="preserve">=(0,0,0), </w:t>
-      </w:r>
-      <w:r>
-        <w:rPr>
-          <w:i/>
-          <w:iCs/>
-        </w:rPr>
-        <w:t>X</w:t>
-      </w:r>
-      <w:r>
-        <w:rPr>
-          <w:vertAlign w:val="subscript"/>
-        </w:rPr>
-        <w:t>1</w:t>
-      </w:r>
-      <w:r>
-        <w:t xml:space="preserve">=(1,1,1) ir </w:t>
-      </w:r>
-      <w:r>
-        <w:rPr>
-          <w:i/>
-          <w:iCs/>
-        </w:rPr>
-        <w:t>X</w:t>
-      </w:r>
-      <w:r>
-        <w:rPr>
-          <w:i/>
-          <w:iCs/>
-          <w:vertAlign w:val="subscript"/>
-        </w:rPr>
-        <w:t>m</w:t>
-      </w:r>
-      <w:r>
-        <w:t>=(a/10,b/10,c/10), čia a,b,c – studento knygelės numerio “2x1xabc” skaitmenys.</w:t>
-      </w:r>
-    </w:p>
-    <w:p>
-      <w:pPr>
-        <w:pStyle w:val="ISITekstas"/>
-      </w:pPr>
-      <w:r>
-        <w:t>Pagal studento kodą, nustačiau A</w:t>
-      </w:r>
-      <w:r>
-        <w:t xml:space="preserve">, </w:t>
-      </w:r>
-      <w:r>
-        <w:t xml:space="preserve">B </w:t>
-      </w:r>
-      <w:r>
-        <w:t xml:space="preserve">ir C </w:t>
-      </w:r>
-      <w:r>
-        <w:t xml:space="preserve">reikšmes </w:t>
-      </w:r>
-      <w:r>
-        <w:t>9, 3 ir 9</w:t>
-      </w:r>
-      <w:r>
-        <w:t xml:space="preserve"> (žr. )</w:t>
-      </w:r>
-      <w:r>
-        <w:t>.</w:t>
-      </w:r>
+      </w:pPr>
     </w:p>
     <w:p>
       <w:pPr>
@@ -1780,6 +1843,7 @@
         <w:pStyle w:val="Caption"/>
         <w:jc w:val="center"/>
       </w:pPr>
+      <w:bookmarkStart w:id="3" w:name="_Ref228485323"/>
       <w:r>
         <w:t xml:space="preserve">pav. </w:t>
       </w:r>
@@ -1798,6 +1862,7 @@
       <w:r>
         <w:fldChar w:fldCharType="end"/>
       </w:r>
+      <w:bookmarkEnd w:id="3"/>
       <w:r>
         <w:t xml:space="preserve"> mano studento skaitmenys</w:t>
       </w:r>
@@ -2031,8 +2096,55 @@
         <w:rPr>
           <w:lang w:val="en-US"/>
         </w:rPr>
-        <w:t xml:space="preserve"> (žr. )</w:t>
-      </w:r>
+        <w:t xml:space="preserve"> (žr. </w:t>
+      </w:r>
+      <w:r>
+        <w:rPr>
+          <w:lang w:val="en-US"/>
+        </w:rPr>
+        <w:fldChar w:fldCharType="begin"/>
+      </w:r>
+      <w:r>
+        <w:rPr>
+          <w:lang w:val="en-US"/>
+        </w:rPr>
+        <w:instrText xml:space="preserve"> REF _Ref228485329 \h </w:instrText>
+      </w:r>
+      <w:r>
+        <w:rPr>
+          <w:lang w:val="en-US"/>
+        </w:rPr>
+      </w:r>
+      <w:r>
+        <w:rPr>
+          <w:lang w:val="en-US"/>
+        </w:rPr>
+        <w:fldChar w:fldCharType="separate"/>
+      </w:r>
+      <w:r>
+        <w:t>pav. 5</w:t>
+      </w:r>
+      <w:r>
+        <w:rPr>
+          <w:lang w:val="en-US"/>
+        </w:rPr>
+        <w:fldChar w:fldCharType="end"/>
+      </w:r>
+      <w:r>
+        <w:rPr>
+          <w:lang w:val="en-US"/>
+        </w:rPr>
+        <w:t>)</w:t>
+      </w:r>
+    </w:p>
+    <w:p>
+      <w:pPr>
+        <w:pStyle w:val="ISITekstas"/>
+        <w:jc w:val="center"/>
+        <w:rPr>
+          <w:lang w:val="en-US"/>
+        </w:rPr>
+      </w:pPr>
     </w:p>
     <w:p>
       <w:pPr>
@@ -2043,8 +2155,8 @@
       </w:pPr>
       <w:r>
         <w:drawing>
-          <wp:inline distT="0" distB="0" distL="0" distR="0" wp14:anchorId="0A392693" wp14:editId="44D0FFCE">
-            <wp:extent cx="1867662" cy="2593976"/>
+          <wp:inline distT="0" distB="0" distL="0" distR="0" wp14:anchorId="0A392693" wp14:editId="115092CC">
+            <wp:extent cx="1719002" cy="2387502"/>
             <wp:effectExtent l="0" t="0" r="0" b="0"/>
             <wp:docPr id="1530474304" name="Picture 1"/>
             <wp:cNvGraphicFramePr>
@@ -2066,7 +2178,7 @@
                   <pic:spPr>
                     <a:xfrm>
                       <a:off x="0" y="0"/>
-                      <a:ext cx="1870286" cy="2597621"/>
+                      <a:ext cx="1727063" cy="2398699"/>
                     </a:xfrm>
                     <a:prstGeom prst="rect">
                       <a:avLst/>
@@ -2087,6 +2199,7 @@
           <w:lang w:val="en-US"/>
         </w:rPr>
       </w:pPr>
+      <w:bookmarkStart w:id="4" w:name="_Ref228485329"/>
       <w:r>
         <w:t xml:space="preserve">pav. </w:t>
       </w:r>
@@ -2105,6 +2218,7 @@
       <w:r>
         <w:fldChar w:fldCharType="end"/>
       </w:r>
+      <w:bookmarkEnd w:id="4"/>
       <w:r>
         <w:t xml:space="preserve"> funkcijų reikšmės taškuose </w:t>
       </w:r>
@@ -2156,6 +2270,7 @@
         </w:rPr>
       </w:pPr>
       <w:r>
+        <w:lastRenderedPageBreak/>
         <w:t>Aprašykite kvadratinę baudos funkciją, apimančią tikslo funkciją ir apribojimus.</w:t>
       </w:r>
     </w:p>
@@ -2863,7 +2978,25 @@
         <w:t>ę kvadratinę baudos funkciją</w:t>
       </w:r>
       <w:r>
-        <w:t xml:space="preserve"> (žr. )</w:t>
+        <w:t xml:space="preserve"> (žr. </w:t>
+      </w:r>
+      <w:r>
+        <w:fldChar w:fldCharType="begin"/>
+      </w:r>
+      <w:r>
+        <w:instrText xml:space="preserve"> REF _Ref228485335 \h </w:instrText>
+      </w:r>
+      <w:r>
+        <w:fldChar w:fldCharType="separate"/>
+      </w:r>
+      <w:r>
+        <w:t>pav. 6</w:t>
+      </w:r>
+      <w:r>
+        <w:fldChar w:fldCharType="end"/>
+      </w:r>
+      <w:r>
+        <w:t>)</w:t>
       </w:r>
       <w:r>
         <w:t>:</w:t>
@@ -3247,9 +3380,9 @@
       </w:pPr>
       <w:r>
         <w:drawing>
-          <wp:inline distT="0" distB="0" distL="0" distR="0" wp14:anchorId="4ADC197B" wp14:editId="58314ECB">
-            <wp:extent cx="3447552" cy="2228394"/>
-            <wp:effectExtent l="0" t="0" r="635" b="635"/>
+          <wp:inline distT="0" distB="0" distL="0" distR="0" wp14:anchorId="4ADC197B" wp14:editId="7D1588F3">
+            <wp:extent cx="3240906" cy="2094824"/>
+            <wp:effectExtent l="0" t="0" r="0" b="1270"/>
             <wp:docPr id="801249992" name="Picture 1"/>
             <wp:cNvGraphicFramePr>
               <a:graphicFrameLocks xmlns:a="http://schemas.openxmlformats.org/drawingml/2006/main" noChangeAspect="1"/>
@@ -3270,7 +3403,7 @@
                   <pic:spPr>
                     <a:xfrm>
                       <a:off x="0" y="0"/>
-                      <a:ext cx="3450387" cy="2230226"/>
+                      <a:ext cx="3248121" cy="2099487"/>
                     </a:xfrm>
                     <a:prstGeom prst="rect">
                       <a:avLst/>
@@ -3291,6 +3424,7 @@
           <w:iCs w:val="0"/>
         </w:rPr>
       </w:pPr>
+      <w:bookmarkStart w:id="5" w:name="_Ref228485335"/>
       <w:r>
         <w:t xml:space="preserve">pav. </w:t>
       </w:r>
@@ -3309,6 +3443,7 @@
       <w:r>
         <w:fldChar w:fldCharType="end"/>
       </w:r>
+      <w:bookmarkEnd w:id="5"/>
       <w:r>
         <w:t xml:space="preserve"> baudos funkcija</w:t>
       </w:r>
@@ -3365,8 +3500,32 @@
         <w:t xml:space="preserve">r </w:t>
       </w:r>
       <w:r>
-        <w:t>(žr. )</w:t>
-      </w:r>
+        <w:t xml:space="preserve">(žr. </w:t>
+      </w:r>
+      <w:r>
+        <w:fldChar w:fldCharType="begin"/>
+      </w:r>
+      <w:r>
+        <w:instrText xml:space="preserve"> REF _Ref228485338 \h </w:instrText>
+      </w:r>
+      <w:r>
+        <w:fldChar w:fldCharType="separate"/>
+      </w:r>
+      <w:r>
+        <w:t>pav. 7</w:t>
+      </w:r>
+      <w:r>
+        <w:fldChar w:fldCharType="end"/>
+      </w:r>
+      <w:r>
+        <w:t>)</w:t>
+      </w:r>
+    </w:p>
+    <w:p>
+      <w:pPr>
+        <w:pStyle w:val="ISITekstas"/>
+        <w:jc w:val="center"/>
+      </w:pPr>
     </w:p>
     <w:p>
       <w:pPr>
@@ -3377,9 +3536,9 @@
       </w:pPr>
       <w:r>
         <w:drawing>
-          <wp:inline distT="0" distB="0" distL="0" distR="0" wp14:anchorId="08D7EC8A" wp14:editId="5E9A2E64">
-            <wp:extent cx="2295525" cy="2676525"/>
-            <wp:effectExtent l="0" t="0" r="9525" b="9525"/>
+          <wp:inline distT="0" distB="0" distL="0" distR="0" wp14:anchorId="08D7EC8A" wp14:editId="703C0360">
+            <wp:extent cx="2041344" cy="2380156"/>
+            <wp:effectExtent l="0" t="0" r="0" b="1270"/>
             <wp:docPr id="1078026481" name="Picture 1"/>
             <wp:cNvGraphicFramePr>
               <a:graphicFrameLocks xmlns:a="http://schemas.openxmlformats.org/drawingml/2006/main" noChangeAspect="1"/>
@@ -3400,7 +3559,7 @@
                   <pic:spPr>
                     <a:xfrm>
                       <a:off x="0" y="0"/>
-                      <a:ext cx="2295525" cy="2676525"/>
+                      <a:ext cx="2045319" cy="2384791"/>
                     </a:xfrm>
                     <a:prstGeom prst="rect">
                       <a:avLst/>
@@ -3421,6 +3580,7 @@
           <w:lang w:val="en-US"/>
         </w:rPr>
       </w:pPr>
+      <w:bookmarkStart w:id="6" w:name="_Ref228485338"/>
       <w:r>
         <w:t xml:space="preserve">pav. </w:t>
       </w:r>
@@ -3439,6 +3599,7 @@
       <w:r>
         <w:fldChar w:fldCharType="end"/>
       </w:r>
+      <w:bookmarkEnd w:id="6"/>
       <w:r>
         <w:t xml:space="preserve"> baudos funkcijos sprendiniai su įvairiomis r reikšmėmis</w:t>
       </w:r>
@@ -3460,6 +3621,7 @@
         </w:rPr>
       </w:pPr>
       <w:r>
+        <w:lastRenderedPageBreak/>
         <w:t xml:space="preserve">Pastebėta, kad </w:t>
       </w:r>
       <w:r>
@@ -3559,11 +3721,55 @@
         <w:pStyle w:val="ISITekstas"/>
       </w:pPr>
       <w:r>
-        <w:t xml:space="preserve">Modifikavau ankstesniame laboratoriniame darbe implementuotą greičiausiojo nusileidimo algoritmą darbui su 3 kintamaisiais bei apskaičiavau funkcijos gradientą (žr. ). </w:t>
-      </w:r>
-      <w:r>
-        <w:t>Su modifikuotu algoritmu, optimizavau baudos funkciją pagal nurodytą tvarką (žr. )</w:t>
-      </w:r>
+        <w:t xml:space="preserve">Modifikavau ankstesniame laboratoriniame darbe implementuotą greičiausiojo nusileidimo algoritmą darbui su 3 kintamaisiais bei apskaičiavau funkcijos gradientą (žr. </w:t>
+      </w:r>
+      <w:r>
+        <w:fldChar w:fldCharType="begin"/>
+      </w:r>
+      <w:r>
+        <w:instrText xml:space="preserve"> REF _Ref228485343 \h </w:instrText>
+      </w:r>
+      <w:r>
+        <w:fldChar w:fldCharType="separate"/>
+      </w:r>
+      <w:r>
+        <w:t>pav. 8</w:t>
+      </w:r>
+      <w:r>
+        <w:fldChar w:fldCharType="end"/>
+      </w:r>
+      <w:r>
+        <w:t xml:space="preserve">). </w:t>
+      </w:r>
+      <w:r>
+        <w:t>Su modifikuotu algoritmu, optimizavau baudos funkciją pagal nurodytą tvarką (žr.</w:t>
+      </w:r>
+      <w:r>
+        <w:t xml:space="preserve"> </w:t>
+      </w:r>
+      <w:r>
+        <w:fldChar w:fldCharType="begin"/>
+      </w:r>
+      <w:r>
+        <w:instrText xml:space="preserve"> REF _Ref228485358 \h </w:instrText>
+      </w:r>
+      <w:r>
+        <w:fldChar w:fldCharType="separate"/>
+      </w:r>
+      <w:r>
+        <w:t>pav. 9</w:t>
+      </w:r>
+      <w:r>
+        <w:fldChar w:fldCharType="end"/>
+      </w:r>
+      <w:r>
+        <w:t>)</w:t>
+      </w:r>
+    </w:p>
+    <w:p>
+      <w:pPr>
+        <w:pStyle w:val="ISITekstas"/>
+      </w:pPr>
     </w:p>
     <w:p>
       <w:pPr>
@@ -3574,7 +3780,7 @@
       </w:pPr>
       <w:r>
         <w:drawing>
-          <wp:inline distT="0" distB="0" distL="0" distR="0" wp14:anchorId="314539FC" wp14:editId="376D9816">
+          <wp:inline distT="0" distB="0" distL="0" distR="0" wp14:anchorId="314539FC" wp14:editId="1A884EC2">
             <wp:extent cx="3596232" cy="3213654"/>
             <wp:effectExtent l="0" t="0" r="4445" b="6350"/>
             <wp:docPr id="188999791" name="Picture 1"/>
@@ -3597,7 +3803,7 @@
                   <pic:spPr>
                     <a:xfrm>
                       <a:off x="0" y="0"/>
-                      <a:ext cx="3604109" cy="3220693"/>
+                      <a:ext cx="3596232" cy="3213654"/>
                     </a:xfrm>
                     <a:prstGeom prst="rect">
                       <a:avLst/>
@@ -3615,6 +3821,7 @@
         <w:pStyle w:val="Caption"/>
         <w:jc w:val="center"/>
       </w:pPr>
+      <w:bookmarkStart w:id="7" w:name="_Ref228485343"/>
       <w:r>
         <w:t xml:space="preserve">pav. </w:t>
       </w:r>
@@ -3633,6 +3840,7 @@
       <w:r>
         <w:fldChar w:fldCharType="end"/>
       </w:r>
+      <w:bookmarkEnd w:id="7"/>
       <w:r>
         <w:t xml:space="preserve"> baudos funkcijos gradientas</w:t>
       </w:r>
@@ -3651,11 +3859,12 @@
         <w:jc w:val="center"/>
       </w:pPr>
       <w:r>
+        <w:lastRenderedPageBreak/>
         <w:drawing>
-          <wp:inline distT="0" distB="0" distL="0" distR="0" wp14:anchorId="01FE3F2B" wp14:editId="68751B2E">
-            <wp:extent cx="3431068" cy="2551710"/>
-            <wp:effectExtent l="0" t="0" r="0" b="1270"/>
-            <wp:docPr id="803885188" name="Picture 1"/>
+          <wp:inline distT="0" distB="0" distL="0" distR="0" wp14:anchorId="3877C4BC" wp14:editId="3D31E57E">
+            <wp:extent cx="3464348" cy="2435134"/>
+            <wp:effectExtent l="0" t="0" r="3175" b="3810"/>
+            <wp:docPr id="2078574254" name="Picture 1"/>
             <wp:cNvGraphicFramePr>
               <a:graphicFrameLocks xmlns:a="http://schemas.openxmlformats.org/drawingml/2006/main" noChangeAspect="1"/>
             </wp:cNvGraphicFramePr>
@@ -3663,7 +3872,7 @@
               <a:graphicData uri="http://schemas.openxmlformats.org/drawingml/2006/picture">
                 <pic:pic xmlns:pic="http://schemas.openxmlformats.org/drawingml/2006/picture">
                   <pic:nvPicPr>
-                    <pic:cNvPr id="803885188" name=""/>
+                    <pic:cNvPr id="2078574254" name=""/>
                     <pic:cNvPicPr/>
                   </pic:nvPicPr>
                   <pic:blipFill>
@@ -3675,7 +3884,7 @@
                   <pic:spPr>
                     <a:xfrm>
                       <a:off x="0" y="0"/>
-                      <a:ext cx="3436795" cy="2555969"/>
+                      <a:ext cx="3479017" cy="2445445"/>
                     </a:xfrm>
                     <a:prstGeom prst="rect">
                       <a:avLst/>
@@ -3693,6 +3902,7 @@
         <w:pStyle w:val="Caption"/>
         <w:jc w:val="center"/>
       </w:pPr>
+      <w:bookmarkStart w:id="8" w:name="_Ref228485358"/>
       <w:r>
         <w:t xml:space="preserve">pav. </w:t>
       </w:r>
@@ -3711,6 +3921,7 @@
       <w:r>
         <w:fldChar w:fldCharType="end"/>
       </w:r>
+      <w:bookmarkEnd w:id="8"/>
       <w:r>
         <w:t xml:space="preserve"> baudos funkcijos minimizavimo žingsniai</w:t>
       </w:r>
@@ -3783,7 +3994,25 @@
         <w:t>m</w:t>
       </w:r>
       <w:r>
-        <w:t xml:space="preserve"> (žr. )</w:t>
+        <w:t xml:space="preserve"> (žr. </w:t>
+      </w:r>
+      <w:r>
+        <w:fldChar w:fldCharType="begin"/>
+      </w:r>
+      <w:r>
+        <w:instrText xml:space="preserve"> REF _Ref228485362 \h </w:instrText>
+      </w:r>
+      <w:r>
+        <w:fldChar w:fldCharType="separate"/>
+      </w:r>
+      <w:r>
+        <w:t>pav. 10</w:t>
+      </w:r>
+      <w:r>
+        <w:fldChar w:fldCharType="end"/>
+      </w:r>
+      <w:r>
+        <w:t>)</w:t>
       </w:r>
     </w:p>
     <w:p>
@@ -3928,6 +4157,31 @@
       <w:r>
         <w:t>, gradientinis metodas</w:t>
       </w:r>
+      <w:r>
+        <w:t xml:space="preserve"> randa teisingą tašką su tokia pat gera paklaida (~0), bet prireikia 302 iteracijų bei 9064 funkcijos skaičiavimų. Svarbu paminėti, kad dėl implementacijos, dauguma šių veiksmų įvyksta su pirmąja </w:t>
+      </w:r>
+      <w:r>
+        <w:rPr>
+          <w:i/>
+          <w:iCs/>
+        </w:rPr>
+        <w:t>r</w:t>
+      </w:r>
+      <w:r>
+        <w:t xml:space="preserve"> reikšme</w:t>
+      </w:r>
+      <w:r>
+        <w:t>.</w:t>
+      </w:r>
+    </w:p>
+    <w:p>
+      <w:pPr>
+        <w:pStyle w:val="ISITekstas"/>
+        <w:jc w:val="center"/>
+        <w:rPr>
+          <w:lang w:val="en-US"/>
+        </w:rPr>
+      </w:pPr>
     </w:p>
     <w:p>
       <w:pPr>
@@ -3938,10 +4192,10 @@
       </w:pPr>
       <w:r>
         <w:drawing>
-          <wp:inline distT="0" distB="0" distL="0" distR="0" wp14:anchorId="21F52C4A" wp14:editId="5BD62CFB">
-            <wp:extent cx="5331638" cy="1688794"/>
-            <wp:effectExtent l="0" t="0" r="2540" b="6985"/>
-            <wp:docPr id="338865331" name="Picture 1"/>
+          <wp:inline distT="0" distB="0" distL="0" distR="0" wp14:anchorId="08D89A9C" wp14:editId="500BF18D">
+            <wp:extent cx="4035324" cy="1535684"/>
+            <wp:effectExtent l="0" t="0" r="3810" b="7620"/>
+            <wp:docPr id="468258297" name="Picture 1"/>
             <wp:cNvGraphicFramePr>
               <a:graphicFrameLocks xmlns:a="http://schemas.openxmlformats.org/drawingml/2006/main" noChangeAspect="1"/>
             </wp:cNvGraphicFramePr>
@@ -3949,7 +4203,7 @@
               <a:graphicData uri="http://schemas.openxmlformats.org/drawingml/2006/picture">
                 <pic:pic xmlns:pic="http://schemas.openxmlformats.org/drawingml/2006/picture">
                   <pic:nvPicPr>
-                    <pic:cNvPr id="338865331" name=""/>
+                    <pic:cNvPr id="468258297" name=""/>
                     <pic:cNvPicPr/>
                   </pic:nvPicPr>
                   <pic:blipFill>
@@ -3961,7 +4215,7 @@
                   <pic:spPr>
                     <a:xfrm>
                       <a:off x="0" y="0"/>
-                      <a:ext cx="5334859" cy="1689814"/>
+                      <a:ext cx="4047385" cy="1540274"/>
                     </a:xfrm>
                     <a:prstGeom prst="rect">
                       <a:avLst/>
@@ -3982,6 +4236,7 @@
           <w:lang w:val="en-US"/>
         </w:rPr>
       </w:pPr>
+      <w:bookmarkStart w:id="9" w:name="_Ref228485362"/>
       <w:r>
         <w:t xml:space="preserve">pav. </w:t>
       </w:r>
@@ -4000,11 +4255,9 @@
       <w:r>
         <w:fldChar w:fldCharType="end"/>
       </w:r>
-      <w:r>
-        <w:t xml:space="preserve"> galutiniai rezultatai taškuose</w:t>
-      </w:r>
-      <w:r>
-        <w:t xml:space="preserve"> </w:t>
+      <w:bookmarkEnd w:id="9"/>
+      <w:r>
+        <w:t xml:space="preserve"> galutiniai rezultatai taškuose </w:t>
       </w:r>
       <w:r>
         <w:t>X</w:t>
@@ -5500,6 +5753,7 @@
   <w:style w:type="character" w:default="1" w:styleId="DefaultParagraphFont">
     <w:name w:val="Default Paragraph Font"/>
     <w:uiPriority w:val="1"/>
+    <w:semiHidden/>
     <w:unhideWhenUsed/>
   </w:style>
   <w:style w:type="table" w:default="1" w:styleId="TableNormal">

</xml_diff>